<commit_message>
feat(week3): add Spring Boot REST implementation
</commit_message>
<xml_diff>
--- a/src/Week3/Spring REST using Spring Boot 3.docx
+++ b/src/Week3/Spring REST using Spring Boot 3.docx
@@ -669,6 +669,46 @@
           <w:szCs w:val="32"/>
         </w:rPr>
       </w:pPr>
+    </w:p>
+    <w:p>
+      <w:pPr>
+        <w:rPr>
+          <w:sz w:val="32"/>
+          <w:szCs w:val="32"/>
+        </w:rPr>
+      </w:pPr>
+    </w:p>
+    <w:p>
+      <w:pPr>
+        <w:rPr>
+          <w:sz w:val="32"/>
+          <w:szCs w:val="32"/>
+        </w:rPr>
+      </w:pPr>
+    </w:p>
+    <w:p>
+      <w:pPr>
+        <w:rPr>
+          <w:sz w:val="32"/>
+          <w:szCs w:val="32"/>
+        </w:rPr>
+      </w:pPr>
+    </w:p>
+    <w:p>
+      <w:pPr>
+        <w:rPr>
+          <w:sz w:val="32"/>
+          <w:szCs w:val="32"/>
+        </w:rPr>
+      </w:pPr>
+    </w:p>
+    <w:p>
+      <w:pPr>
+        <w:rPr>
+          <w:sz w:val="32"/>
+          <w:szCs w:val="32"/>
+        </w:rPr>
+      </w:pPr>
       <w:r>
         <w:rPr>
           <w:b/>
@@ -676,6 +716,7 @@
           <w:sz w:val="32"/>
           <w:szCs w:val="32"/>
         </w:rPr>
+        <w:lastRenderedPageBreak/>
         <w:t>Create authentication service that returns JWT</w:t>
       </w:r>
       <w:r>
@@ -693,6 +734,315 @@
           <w:szCs w:val="32"/>
         </w:rPr>
       </w:pPr>
+      <w:r>
+        <w:rPr>
+          <w:b/>
+          <w:bCs/>
+          <w:sz w:val="32"/>
+          <w:szCs w:val="32"/>
+        </w:rPr>
+        <w:t xml:space="preserve">Create authentication controller and configure it in </w:t>
+      </w:r>
+      <w:proofErr w:type="spellStart"/>
+      <w:r>
+        <w:rPr>
+          <w:b/>
+          <w:bCs/>
+          <w:sz w:val="32"/>
+          <w:szCs w:val="32"/>
+        </w:rPr>
+        <w:t>SecurityConfig</w:t>
+      </w:r>
+      <w:proofErr w:type="spellEnd"/>
+      <w:r>
+        <w:rPr>
+          <w:sz w:val="32"/>
+          <w:szCs w:val="32"/>
+        </w:rPr>
+        <w:t> </w:t>
+      </w:r>
+    </w:p>
+    <w:p>
+      <w:pPr>
+        <w:rPr>
+          <w:sz w:val="32"/>
+          <w:szCs w:val="32"/>
+        </w:rPr>
+      </w:pPr>
+      <w:r>
+        <w:rPr>
+          <w:sz w:val="32"/>
+          <w:szCs w:val="32"/>
+        </w:rPr>
+        <w:drawing>
+          <wp:inline distT="0" distB="0" distL="0" distR="0" wp14:anchorId="102D87A3" wp14:editId="407C2425">
+            <wp:extent cx="5402580" cy="2724634"/>
+            <wp:effectExtent l="0" t="0" r="7620" b="0"/>
+            <wp:docPr id="1300268037" name="Picture 1"/>
+            <wp:cNvGraphicFramePr>
+              <a:graphicFrameLocks xmlns:a="http://schemas.openxmlformats.org/drawingml/2006/main" noChangeAspect="1"/>
+            </wp:cNvGraphicFramePr>
+            <a:graphic xmlns:a="http://schemas.openxmlformats.org/drawingml/2006/main">
+              <a:graphicData uri="http://schemas.openxmlformats.org/drawingml/2006/picture">
+                <pic:pic xmlns:pic="http://schemas.openxmlformats.org/drawingml/2006/picture">
+                  <pic:nvPicPr>
+                    <pic:cNvPr id="1300268037" name=""/>
+                    <pic:cNvPicPr/>
+                  </pic:nvPicPr>
+                  <pic:blipFill>
+                    <a:blip r:embed="rId12"/>
+                    <a:stretch>
+                      <a:fillRect/>
+                    </a:stretch>
+                  </pic:blipFill>
+                  <pic:spPr>
+                    <a:xfrm>
+                      <a:off x="0" y="0"/>
+                      <a:ext cx="5407139" cy="2726933"/>
+                    </a:xfrm>
+                    <a:prstGeom prst="rect">
+                      <a:avLst/>
+                    </a:prstGeom>
+                  </pic:spPr>
+                </pic:pic>
+              </a:graphicData>
+            </a:graphic>
+          </wp:inline>
+        </w:drawing>
+      </w:r>
+    </w:p>
+    <w:p>
+      <w:pPr>
+        <w:rPr>
+          <w:sz w:val="32"/>
+          <w:szCs w:val="32"/>
+        </w:rPr>
+      </w:pPr>
+      <w:r>
+        <w:rPr>
+          <w:sz w:val="32"/>
+          <w:szCs w:val="32"/>
+        </w:rPr>
+        <w:drawing>
+          <wp:inline distT="0" distB="0" distL="0" distR="0" wp14:anchorId="0E42F191" wp14:editId="3A53315F">
+            <wp:extent cx="4328160" cy="1425138"/>
+            <wp:effectExtent l="0" t="0" r="0" b="3810"/>
+            <wp:docPr id="1353972379" name="Picture 1"/>
+            <wp:cNvGraphicFramePr>
+              <a:graphicFrameLocks xmlns:a="http://schemas.openxmlformats.org/drawingml/2006/main" noChangeAspect="1"/>
+            </wp:cNvGraphicFramePr>
+            <a:graphic xmlns:a="http://schemas.openxmlformats.org/drawingml/2006/main">
+              <a:graphicData uri="http://schemas.openxmlformats.org/drawingml/2006/picture">
+                <pic:pic xmlns:pic="http://schemas.openxmlformats.org/drawingml/2006/picture">
+                  <pic:nvPicPr>
+                    <pic:cNvPr id="1353972379" name=""/>
+                    <pic:cNvPicPr/>
+                  </pic:nvPicPr>
+                  <pic:blipFill>
+                    <a:blip r:embed="rId13"/>
+                    <a:stretch>
+                      <a:fillRect/>
+                    </a:stretch>
+                  </pic:blipFill>
+                  <pic:spPr>
+                    <a:xfrm>
+                      <a:off x="0" y="0"/>
+                      <a:ext cx="4333724" cy="1426970"/>
+                    </a:xfrm>
+                    <a:prstGeom prst="rect">
+                      <a:avLst/>
+                    </a:prstGeom>
+                  </pic:spPr>
+                </pic:pic>
+              </a:graphicData>
+            </a:graphic>
+          </wp:inline>
+        </w:drawing>
+      </w:r>
+    </w:p>
+    <w:p>
+      <w:pPr>
+        <w:rPr>
+          <w:sz w:val="32"/>
+          <w:szCs w:val="32"/>
+        </w:rPr>
+      </w:pPr>
+      <w:r>
+        <w:rPr>
+          <w:b/>
+          <w:bCs/>
+          <w:sz w:val="32"/>
+          <w:szCs w:val="32"/>
+        </w:rPr>
+        <w:t>Read Authorization header and decode the username and password</w:t>
+      </w:r>
+    </w:p>
+    <w:p>
+      <w:pPr>
+        <w:rPr>
+          <w:sz w:val="32"/>
+          <w:szCs w:val="32"/>
+        </w:rPr>
+      </w:pPr>
+      <w:r>
+        <w:rPr>
+          <w:sz w:val="32"/>
+          <w:szCs w:val="32"/>
+        </w:rPr>
+        <w:drawing>
+          <wp:inline distT="0" distB="0" distL="0" distR="0" wp14:anchorId="4F6D394B" wp14:editId="0328C43E">
+            <wp:extent cx="5844540" cy="2674620"/>
+            <wp:effectExtent l="0" t="0" r="3810" b="0"/>
+            <wp:docPr id="9874507" name="Picture 1"/>
+            <wp:cNvGraphicFramePr>
+              <a:graphicFrameLocks xmlns:a="http://schemas.openxmlformats.org/drawingml/2006/main" noChangeAspect="1"/>
+            </wp:cNvGraphicFramePr>
+            <a:graphic xmlns:a="http://schemas.openxmlformats.org/drawingml/2006/main">
+              <a:graphicData uri="http://schemas.openxmlformats.org/drawingml/2006/picture">
+                <pic:pic xmlns:pic="http://schemas.openxmlformats.org/drawingml/2006/picture">
+                  <pic:nvPicPr>
+                    <pic:cNvPr id="9874507" name=""/>
+                    <pic:cNvPicPr/>
+                  </pic:nvPicPr>
+                  <pic:blipFill>
+                    <a:blip r:embed="rId14"/>
+                    <a:stretch>
+                      <a:fillRect/>
+                    </a:stretch>
+                  </pic:blipFill>
+                  <pic:spPr>
+                    <a:xfrm>
+                      <a:off x="0" y="0"/>
+                      <a:ext cx="5844540" cy="2674620"/>
+                    </a:xfrm>
+                    <a:prstGeom prst="rect">
+                      <a:avLst/>
+                    </a:prstGeom>
+                  </pic:spPr>
+                </pic:pic>
+              </a:graphicData>
+            </a:graphic>
+          </wp:inline>
+        </w:drawing>
+      </w:r>
+    </w:p>
+    <w:p>
+      <w:pPr>
+        <w:rPr>
+          <w:b/>
+          <w:bCs/>
+          <w:sz w:val="32"/>
+          <w:szCs w:val="32"/>
+        </w:rPr>
+      </w:pPr>
+      <w:r>
+        <w:rPr>
+          <w:b/>
+          <w:bCs/>
+          <w:sz w:val="32"/>
+          <w:szCs w:val="32"/>
+        </w:rPr>
+        <w:lastRenderedPageBreak/>
+        <w:t>Generate token based on the user</w:t>
+      </w:r>
+    </w:p>
+    <w:p>
+      <w:pPr>
+        <w:rPr>
+          <w:sz w:val="32"/>
+          <w:szCs w:val="32"/>
+        </w:rPr>
+      </w:pPr>
+      <w:r>
+        <w:rPr>
+          <w:sz w:val="32"/>
+          <w:szCs w:val="32"/>
+        </w:rPr>
+        <w:drawing>
+          <wp:inline distT="0" distB="0" distL="0" distR="0" wp14:anchorId="7FCDB6E0" wp14:editId="52986D8D">
+            <wp:extent cx="5731510" cy="2946400"/>
+            <wp:effectExtent l="0" t="0" r="2540" b="6350"/>
+            <wp:docPr id="1927365713" name="Picture 1"/>
+            <wp:cNvGraphicFramePr>
+              <a:graphicFrameLocks xmlns:a="http://schemas.openxmlformats.org/drawingml/2006/main" noChangeAspect="1"/>
+            </wp:cNvGraphicFramePr>
+            <a:graphic xmlns:a="http://schemas.openxmlformats.org/drawingml/2006/main">
+              <a:graphicData uri="http://schemas.openxmlformats.org/drawingml/2006/picture">
+                <pic:pic xmlns:pic="http://schemas.openxmlformats.org/drawingml/2006/picture">
+                  <pic:nvPicPr>
+                    <pic:cNvPr id="1927365713" name=""/>
+                    <pic:cNvPicPr/>
+                  </pic:nvPicPr>
+                  <pic:blipFill>
+                    <a:blip r:embed="rId15"/>
+                    <a:stretch>
+                      <a:fillRect/>
+                    </a:stretch>
+                  </pic:blipFill>
+                  <pic:spPr>
+                    <a:xfrm>
+                      <a:off x="0" y="0"/>
+                      <a:ext cx="5731510" cy="2946400"/>
+                    </a:xfrm>
+                    <a:prstGeom prst="rect">
+                      <a:avLst/>
+                    </a:prstGeom>
+                  </pic:spPr>
+                </pic:pic>
+              </a:graphicData>
+            </a:graphic>
+          </wp:inline>
+        </w:drawing>
+      </w:r>
+    </w:p>
+    <w:p>
+      <w:pPr>
+        <w:rPr>
+          <w:sz w:val="32"/>
+          <w:szCs w:val="32"/>
+        </w:rPr>
+      </w:pPr>
+      <w:r>
+        <w:rPr>
+          <w:sz w:val="32"/>
+          <w:szCs w:val="32"/>
+        </w:rPr>
+        <w:drawing>
+          <wp:inline distT="0" distB="0" distL="0" distR="0" wp14:anchorId="1CBAEE05" wp14:editId="36C3EDB2">
+            <wp:extent cx="5731510" cy="1186815"/>
+            <wp:effectExtent l="0" t="0" r="2540" b="0"/>
+            <wp:docPr id="1309310453" name="Picture 1"/>
+            <wp:cNvGraphicFramePr>
+              <a:graphicFrameLocks xmlns:a="http://schemas.openxmlformats.org/drawingml/2006/main" noChangeAspect="1"/>
+            </wp:cNvGraphicFramePr>
+            <a:graphic xmlns:a="http://schemas.openxmlformats.org/drawingml/2006/main">
+              <a:graphicData uri="http://schemas.openxmlformats.org/drawingml/2006/picture">
+                <pic:pic xmlns:pic="http://schemas.openxmlformats.org/drawingml/2006/picture">
+                  <pic:nvPicPr>
+                    <pic:cNvPr id="1309310453" name=""/>
+                    <pic:cNvPicPr/>
+                  </pic:nvPicPr>
+                  <pic:blipFill>
+                    <a:blip r:embed="rId16"/>
+                    <a:stretch>
+                      <a:fillRect/>
+                    </a:stretch>
+                  </pic:blipFill>
+                  <pic:spPr>
+                    <a:xfrm>
+                      <a:off x="0" y="0"/>
+                      <a:ext cx="5731510" cy="1186815"/>
+                    </a:xfrm>
+                    <a:prstGeom prst="rect">
+                      <a:avLst/>
+                    </a:prstGeom>
+                  </pic:spPr>
+                </pic:pic>
+              </a:graphicData>
+            </a:graphic>
+          </wp:inline>
+        </w:drawing>
+      </w:r>
     </w:p>
     <w:sectPr>
       <w:pgSz w:w="11906" w:h="16838"/>

</xml_diff>